<commit_message>
Master Standard v1.93: put the v1.93 history entry first
Co-Authored-By: Claude Sonnet 5.5 <noreply@anthropic.com>
Claude-Session: https://claude.ai/code/session_01SU4EMZyBZcyNsD87Q3UTvj
</commit_message>
<xml_diff>
--- a/controlling-documents/Zay-Marie_Press_Digital_Studies_Master_Standard_v1.93.docx
+++ b/controlling-documents/Zay-Marie_Press_Digital_Studies_Master_Standard_v1.93.docx
@@ -3755,15 +3755,15 @@
         <w:pStyle w:val="ListBullet"/>
       </w:pPr>
       <w:r>
+        <w:t>v1.93 — Amends Rule 31 on how Reader Questions positions are settled, at the publisher’s approval (2026-10-10): Claude drafts every entry by the Framework, recorded rulings and the passage’s context without a prior ruling on each question, notes which positions are settled and which are Claude’s reading, and gives one “needs your eye” list per volume; rulings are recorded in the series Standard. Replaces the v1.90 requirement that each position be ruled before drafting. Digital Studies content rules are unaffected.</w:t>
+      </w:r>
+    </w:p>
+    <w:p>
+      <w:pPr>
+        <w:pStyle w:val="ListBullet"/>
+      </w:pPr>
+      <w:r>
         <w:t>v1.92 — Records the Reader Questions volume price in Rule 31: $7.99 a volume, at the publisher’s ruling (2026-10-10); the first Questions page (ten free answers) is previewed and approved. Digital Studies content rules are unaffected.</w:t>
-      </w:r>
-    </w:p>
-    <w:p>
-      <w:pPr>
-        <w:pStyle w:val="ListBullet"/>
-      </w:pPr>
-      <w:r>
-        <w:t>v1.93 — Amends Rule 31 on how Reader Questions positions are settled, at the publisher’s approval (2026-10-10): Claude drafts every entry by the Framework, recorded rulings and the passage’s context without a prior ruling on each question, notes which positions are settled and which are Claude’s reading, and gives one “needs your eye” list per volume; rulings are recorded in the series Standard. Replaces the v1.90 requirement that each position be ruled before drafting. Digital Studies content rules are unaffected.</w:t>
       </w:r>
     </w:p>
     <w:p>

</xml_diff>